<commit_message>
TG-000: Update credentials, clean unused doc references, restrict Jenkins to production
</commit_message>
<xml_diff>
--- a/Readme.docx
+++ b/Readme.docx
@@ -238,7 +238,9 @@
         <w:br/>
         <w:t xml:space="preserve">            WebApp[Web App Pods &lt;br&gt; Flask / React]:::k8s</w:t>
         <w:br/>
-        <w:t xml:space="preserve">            LB[Load Balancer &lt;br&gt; MetalLB / NGINX]:::k8s</w:t>
+        <w:t xml:space="preserve">            LB[Load Balancer]:::k8s</w:t>
+        <w:br/>
+        <w:t xml:space="preserve">            %% Note: MetalLB and NGINX are not used currently.</w:t>
         <w:br/>
         <w:t xml:space="preserve">        end</w:t>
         <w:br/>
@@ -325,7 +327,7 @@
     </w:p>
     <w:tbl>
       <w:tblPr>
-        <w:tblStyle w:val="LightShading-Accent1"/>
+        <w:tblStyle w:val="TableGrid"/>
         <w:tblW w:type="auto" w:w="0"/>
         <w:tblLook w:firstColumn="1" w:firstRow="1" w:lastColumn="0" w:lastRow="0" w:noHBand="0" w:noVBand="1" w:val="04A0"/>
       </w:tblPr>
@@ -390,7 +392,7 @@
     </w:tbl>
     <w:tbl>
       <w:tblPr>
-        <w:tblStyle w:val="LightShading-Accent1"/>
+        <w:tblStyle w:val="TableGrid"/>
         <w:tblW w:type="auto" w:w="0"/>
         <w:tblLook w:firstColumn="1" w:firstRow="1" w:lastColumn="0" w:lastRow="0" w:noHBand="0" w:noVBand="1" w:val="04A0"/>
       </w:tblPr>
@@ -455,7 +457,7 @@
     </w:tbl>
     <w:tbl>
       <w:tblPr>
-        <w:tblStyle w:val="LightShading-Accent1"/>
+        <w:tblStyle w:val="TableGrid"/>
         <w:tblW w:type="auto" w:w="0"/>
         <w:tblLook w:firstColumn="1" w:firstRow="1" w:lastColumn="0" w:lastRow="0" w:noHBand="0" w:noVBand="1" w:val="04A0"/>
       </w:tblPr>
@@ -520,7 +522,7 @@
     </w:tbl>
     <w:tbl>
       <w:tblPr>
-        <w:tblStyle w:val="LightShading-Accent1"/>
+        <w:tblStyle w:val="TableGrid"/>
         <w:tblW w:type="auto" w:w="0"/>
         <w:tblLook w:firstColumn="1" w:firstRow="1" w:lastColumn="0" w:lastRow="0" w:noHBand="0" w:noVBand="1" w:val="04A0"/>
       </w:tblPr>
@@ -585,7 +587,7 @@
     </w:tbl>
     <w:tbl>
       <w:tblPr>
-        <w:tblStyle w:val="LightShading-Accent1"/>
+        <w:tblStyle w:val="TableGrid"/>
         <w:tblW w:type="auto" w:w="0"/>
         <w:tblLook w:firstColumn="1" w:firstRow="1" w:lastColumn="0" w:lastRow="0" w:noHBand="0" w:noVBand="1" w:val="04A0"/>
       </w:tblPr>
@@ -650,7 +652,7 @@
     </w:tbl>
     <w:tbl>
       <w:tblPr>
-        <w:tblStyle w:val="LightShading-Accent1"/>
+        <w:tblStyle w:val="TableGrid"/>
         <w:tblW w:type="auto" w:w="0"/>
         <w:tblLook w:firstColumn="1" w:firstRow="1" w:lastColumn="0" w:lastRow="0" w:noHBand="0" w:noVBand="1" w:val="04A0"/>
       </w:tblPr>

</xml_diff>